<commit_message>
Module1 assignment 1.2_updataed with all the screenshots and repo link.
</commit_message>
<xml_diff>
--- a/module-1/Turman-Assignment1_2.docx
+++ b/module-1/Turman-Assignment1_2.docx
@@ -2,16 +2,176 @@
 <file path=word/document.xml><?xml version="1.0" encoding="utf-8"?>
 <w:document xmlns:wpc="http://schemas.microsoft.com/office/word/2010/wordprocessingCanvas" xmlns:mc="http://schemas.openxmlformats.org/markup-compatibility/2006" xmlns:o="urn:schemas-microsoft-com:office:office" xmlns:r="http://schemas.openxmlformats.org/officeDocument/2006/relationships" xmlns:m="http://schemas.openxmlformats.org/officeDocument/2006/math" xmlns:v="urn:schemas-microsoft-com:vml" xmlns:wp14="http://schemas.microsoft.com/office/word/2010/wordprocessingDrawing" xmlns:wp="http://schemas.openxmlformats.org/drawingml/2006/wordprocessingDrawing" xmlns:w10="urn:schemas-microsoft-com:office:word" xmlns:w="http://schemas.openxmlformats.org/wordprocessingml/2006/main" xmlns:w14="http://schemas.microsoft.com/office/word/2010/wordml" xmlns:w15="http://schemas.microsoft.com/office/word/2012/wordml" xmlns:wpg="http://schemas.microsoft.com/office/word/2010/wordprocessingGroup" xmlns:wpi="http://schemas.microsoft.com/office/word/2010/wordprocessingInk" xmlns:wne="http://schemas.microsoft.com/office/word/2006/wordml" xmlns:wps="http://schemas.microsoft.com/office/word/2010/wordprocessingShape" xmlns:w16se="http://schemas.microsoft.com/office/word/2015/wordml/symex" xmlns:w16cid="http://schemas.microsoft.com/office/word/2016/wordml/cid" xmlns:w16="http://schemas.microsoft.com/office/word/2018/wordml" xmlns:w16cex="http://schemas.microsoft.com/office/word/2018/wordml/cex" xmlns:w16sdtdh="http://schemas.microsoft.com/office/word/2020/wordml/sdtdatahash" xmlns:w16sdtfl="http://schemas.microsoft.com/office/word/2024/wordml/sdtformatlock" xmlns:a="http://schemas.openxmlformats.org/drawingml/2006/main" xmlns:pic="http://schemas.openxmlformats.org/drawingml/2006/picture" xmlns:a14="http://schemas.microsoft.com/office/drawing/2010/main" mc:Ignorable="w14 w15 wp14 w16se w16cid w16 w16cex w16sdtdh w16sdtfl">
   <w:body>
-    <w:p xmlns:wp14="http://schemas.microsoft.com/office/word/2010/wordml" wp14:paraId="2C078E63" wp14:textId="1B3854F9">
+    <w:p xmlns:wp14="http://schemas.microsoft.com/office/word/2010/wordml" wp14:paraId="2C078E63" wp14:textId="484DDF79">
       <w:pPr>
         <w:pStyle w:val="Normal"/>
       </w:pPr>
       <w:r>
+        <w:br/>
+      </w:r>
+      <w:hyperlink r:id="Rcfa4bba584914042">
+        <w:r>
+          <w:rPr>
+            <w:rStyle w:val="Hyperlink"/>
+            <w:noProof w:val="0"/>
+            <w:lang w:val="en-US"/>
+          </w:rPr>
+          <w:t>PolymathAlchemist/csd-325: CSD325-T301 Advanced Python coursework</w:t>
+        </w:r>
+      </w:hyperlink>
+      <w:r>
+        <w:br/>
+      </w:r>
+      <w:r>
+        <w:br/>
+      </w:r>
+      <w:r>
         <w:drawing>
-          <wp:inline xmlns:wp14="http://schemas.microsoft.com/office/word/2010/wordprocessingDrawing" wp14:editId="2EEF4575" wp14:anchorId="0A49045E">
+          <wp:inline xmlns:wp14="http://schemas.microsoft.com/office/word/2010/wordprocessingDrawing" wp14:editId="165C86F1" wp14:anchorId="2D52EE34">
+            <wp:extent cx="5943600" cy="4267200"/>
+            <wp:effectExtent l="0" t="0" r="0" b="0"/>
+            <wp:docPr id="240472370" name="drawing"/>
+            <wp:cNvGraphicFramePr>
+              <a:graphicFrameLocks noChangeAspect="1"/>
+            </wp:cNvGraphicFramePr>
+            <a:graphic>
+              <a:graphicData xmlns:a="http://schemas.openxmlformats.org/drawingml/2006/main" uri="http://schemas.openxmlformats.org/drawingml/2006/picture">
+                <pic:pic xmlns:pic="http://schemas.openxmlformats.org/drawingml/2006/picture">
+                  <pic:nvPicPr>
+                    <pic:cNvPr id="240472370" name="Picture 240472370"/>
+                    <pic:cNvPicPr/>
+                  </pic:nvPicPr>
+                  <pic:blipFill>
+                    <a:blip xmlns:r="http://schemas.openxmlformats.org/officeDocument/2006/relationships" r:embed="rId564038184">
+                      <a:extLst>
+                        <a:ext uri="{28A0092B-C50C-407E-A947-70E740481C1C}">
+                          <a14:useLocalDpi xmlns:a14="http://schemas.microsoft.com/office/drawing/2010/main"/>
+                        </a:ext>
+                      </a:extLst>
+                    </a:blip>
+                    <a:stretch>
+                      <a:fillRect/>
+                    </a:stretch>
+                  </pic:blipFill>
+                  <pic:spPr>
+                    <a:xfrm>
+                      <a:off x="0" y="0"/>
+                      <a:ext cx="5943600" cy="4267200"/>
+                    </a:xfrm>
+                    <a:prstGeom prst="rect">
+                      <a:avLst/>
+                    </a:prstGeom>
+                  </pic:spPr>
+                </pic:pic>
+              </a:graphicData>
+            </a:graphic>
+          </wp:inline>
+        </w:drawing>
+      </w:r>
+      <w:r>
+        <w:br/>
+      </w:r>
+      <w:r>
+        <w:br/>
+      </w:r>
+      <w:r>
+        <w:br/>
+      </w:r>
+      <w:r>
+        <w:drawing>
+          <wp:inline xmlns:wp14="http://schemas.microsoft.com/office/word/2010/wordprocessingDrawing" wp14:editId="42AE0697" wp14:anchorId="0ADDFB71">
+            <wp:extent cx="5943600" cy="3400425"/>
+            <wp:effectExtent l="0" t="0" r="0" b="0"/>
+            <wp:docPr id="1347708850" name="drawing"/>
+            <wp:cNvGraphicFramePr>
+              <a:graphicFrameLocks noChangeAspect="1"/>
+            </wp:cNvGraphicFramePr>
+            <a:graphic>
+              <a:graphicData xmlns:a="http://schemas.openxmlformats.org/drawingml/2006/main" uri="http://schemas.openxmlformats.org/drawingml/2006/picture">
+                <pic:pic xmlns:pic="http://schemas.openxmlformats.org/drawingml/2006/picture">
+                  <pic:nvPicPr>
+                    <pic:cNvPr id="1347708850" name="Picture 1347708850"/>
+                    <pic:cNvPicPr/>
+                  </pic:nvPicPr>
+                  <pic:blipFill>
+                    <a:blip xmlns:r="http://schemas.openxmlformats.org/officeDocument/2006/relationships" r:embed="rId2033096137">
+                      <a:extLst>
+                        <a:ext uri="{28A0092B-C50C-407E-A947-70E740481C1C}">
+                          <a14:useLocalDpi xmlns:a14="http://schemas.microsoft.com/office/drawing/2010/main"/>
+                        </a:ext>
+                      </a:extLst>
+                    </a:blip>
+                    <a:stretch>
+                      <a:fillRect/>
+                    </a:stretch>
+                  </pic:blipFill>
+                  <pic:spPr>
+                    <a:xfrm>
+                      <a:off x="0" y="0"/>
+                      <a:ext cx="5943600" cy="3400425"/>
+                    </a:xfrm>
+                    <a:prstGeom prst="rect">
+                      <a:avLst/>
+                    </a:prstGeom>
+                  </pic:spPr>
+                </pic:pic>
+              </a:graphicData>
+            </a:graphic>
+          </wp:inline>
+        </w:drawing>
+      </w:r>
+      <w:r>
+        <w:br/>
+      </w:r>
+      <w:r>
+        <w:drawing>
+          <wp:inline xmlns:wp14="http://schemas.microsoft.com/office/word/2010/wordprocessingDrawing" wp14:editId="5D2C1651" wp14:anchorId="07CC0006">
+            <wp:extent cx="5943600" cy="3400425"/>
+            <wp:effectExtent l="0" t="0" r="0" b="0"/>
+            <wp:docPr id="60840914" name="drawing"/>
+            <wp:cNvGraphicFramePr>
+              <a:graphicFrameLocks noChangeAspect="1"/>
+            </wp:cNvGraphicFramePr>
+            <a:graphic>
+              <a:graphicData xmlns:a="http://schemas.openxmlformats.org/drawingml/2006/main" uri="http://schemas.openxmlformats.org/drawingml/2006/picture">
+                <pic:pic xmlns:pic="http://schemas.openxmlformats.org/drawingml/2006/picture">
+                  <pic:nvPicPr>
+                    <pic:cNvPr id="44737934" name="Picture 44737934"/>
+                    <pic:cNvPicPr/>
+                  </pic:nvPicPr>
+                  <pic:blipFill>
+                    <a:blip xmlns:r="http://schemas.openxmlformats.org/officeDocument/2006/relationships" r:embed="rId804324694">
+                      <a:extLst>
+                        <a:ext uri="{28A0092B-C50C-407E-A947-70E740481C1C}">
+                          <a14:useLocalDpi xmlns:a14="http://schemas.microsoft.com/office/drawing/2010/main"/>
+                        </a:ext>
+                      </a:extLst>
+                    </a:blip>
+                    <a:stretch>
+                      <a:fillRect/>
+                    </a:stretch>
+                  </pic:blipFill>
+                  <pic:spPr>
+                    <a:xfrm>
+                      <a:off x="0" y="0"/>
+                      <a:ext cx="5943600" cy="3400425"/>
+                    </a:xfrm>
+                    <a:prstGeom prst="rect">
+                      <a:avLst/>
+                    </a:prstGeom>
+                  </pic:spPr>
+                </pic:pic>
+              </a:graphicData>
+            </a:graphic>
+          </wp:inline>
+        </w:drawing>
+      </w:r>
+      <w:r>
+        <w:drawing>
+          <wp:inline xmlns:wp14="http://schemas.microsoft.com/office/word/2010/wordprocessingDrawing" wp14:editId="42943DD3" wp14:anchorId="41753C23">
             <wp:extent cx="5943600" cy="4762500"/>
             <wp:effectExtent l="0" t="0" r="0" b="0"/>
-            <wp:docPr id="1144067747" name="drawing"/>
+            <wp:docPr id="312703151" name="drawing"/>
             <wp:cNvGraphicFramePr>
               <a:graphicFrameLocks noChangeAspect="1"/>
             </wp:cNvGraphicFramePr>
@@ -481,6 +641,17 @@
     <w:semiHidden/>
     <w:unhideWhenUsed/>
   </w:style>
+  <w:style w:type="character" w:styleId="Hyperlink">
+    <w:uiPriority w:val="99"/>
+    <w:name w:val="Hyperlink"/>
+    <w:basedOn w:val="DefaultParagraphFont"/>
+    <w:unhideWhenUsed/>
+    <w:rsid w:val="11C48B3F"/>
+    <w:rPr>
+      <w:color w:val="467886"/>
+      <w:u w:val="single"/>
+    </w:rPr>
+  </w:style>
 </w:styles>
 </file>
 

</xml_diff>